<commit_message>
Hoá đơn: mẫu giấy đề nghị thanh toán mặc định theo Mẫu 05-TT (TT 99/2025/TT-BTC), bảng ký 4 cột; thêm test cho 2 mẫu mặc định
Co-Authored-By: Claude Opus 5.5 <noreply@anthropic.com>
</commit_message>
<xml_diff>
--- a/apps/hoadon/public/mau/de-nghi-thanh-toan.docx
+++ b/apps/hoadon/public/mau/de-nghi-thanh-toan.docx
@@ -54,13 +54,13 @@
               <mc:AlternateContent>
                 <mc:Choice Requires="wps">
                   <w:drawing>
-                    <wp:anchor distT="4294967295" distB="4294967295" distL="114300" distR="114300" simplePos="0" relativeHeight="251666432" behindDoc="0" locked="0" layoutInCell="1" allowOverlap="1" wp14:anchorId="784110C5" wp14:editId="732D5444">
+                    <wp:anchor distT="4294967295" distB="4294967295" distL="114300" distR="114300" simplePos="0" relativeHeight="251666432" behindDoc="0" locked="0" layoutInCell="1" allowOverlap="1" wp14:anchorId="784110C5" wp14:editId="2DD496D0">
                       <wp:simplePos x="0" y="0"/>
                       <wp:positionH relativeFrom="column">
-                        <wp:posOffset>997585</wp:posOffset>
+                        <wp:posOffset>1016635</wp:posOffset>
                       </wp:positionH>
                       <wp:positionV relativeFrom="paragraph">
-                        <wp:posOffset>212724</wp:posOffset>
+                        <wp:posOffset>212090</wp:posOffset>
                       </wp:positionV>
                       <wp:extent cx="1143000" cy="0"/>
                       <wp:effectExtent l="0" t="0" r="0" b="0"/>
@@ -108,7 +108,7 @@
                 </mc:Choice>
                 <mc:Fallback>
                   <w:pict>
-                    <v:line w14:anchorId="66A73A6C" id="Straight Connector 1" o:spid="_x0000_s1026" style="position:absolute;z-index:251666432;visibility:visible;mso-wrap-style:square;mso-width-percent:0;mso-height-percent:0;mso-wrap-distance-left:9pt;mso-wrap-distance-top:-3e-5mm;mso-wrap-distance-right:9pt;mso-wrap-distance-bottom:-3e-5mm;mso-position-horizontal:absolute;mso-position-horizontal-relative:text;mso-position-vertical:absolute;mso-position-vertical-relative:text;mso-width-percent:0;mso-height-percent:0;mso-width-relative:page;mso-height-relative:page" from="78.55pt,16.75pt" to="168.55pt,16.75pt" o:gfxdata="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"/>
+                    <v:line w14:anchorId="2733C3FB" id="Straight Connector 1" o:spid="_x0000_s1026" style="position:absolute;z-index:251666432;visibility:visible;mso-wrap-style:square;mso-width-percent:0;mso-height-percent:0;mso-wrap-distance-left:9pt;mso-wrap-distance-top:-3e-5mm;mso-wrap-distance-right:9pt;mso-wrap-distance-bottom:-3e-5mm;mso-position-horizontal:absolute;mso-position-horizontal-relative:text;mso-position-vertical:absolute;mso-position-vertical-relative:text;mso-width-percent:0;mso-height-percent:0;mso-width-relative:page;mso-height-relative:page" from="80.05pt,16.7pt" to="170.05pt,16.7pt" o:gfxdata="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"/>
                   </w:pict>
                 </mc:Fallback>
               </mc:AlternateContent>
@@ -164,36 +164,36 @@
               <w:spacing w:line="288" w:lineRule="auto"/>
               <w:jc w:val="center"/>
               <w:rPr>
+                <w:i/>
+                <w:iCs/>
+                <w:lang w:val="nl-NL"/>
+              </w:rPr>
+            </w:pPr>
+            <w:r>
+              <w:rPr>
+                <w:i/>
+                <w:iCs/>
+                <w:lang w:val="nl-NL"/>
+              </w:rPr>
+              <w:t>(Kèm theo Thông tư số 99/2025/TT-BTC</w:t>
+            </w:r>
+          </w:p>
+          <w:p>
+            <w:pPr>
+              <w:spacing w:line="288" w:lineRule="auto"/>
+              <w:jc w:val="center"/>
+              <w:rPr>
                 <w:sz w:val="26"/>
                 <w:szCs w:val="26"/>
-                <w:lang w:val="nl-NL"/>
               </w:rPr>
             </w:pPr>
             <w:r>
               <w:rPr>
-                <w:sz w:val="26"/>
-                <w:szCs w:val="26"/>
-                <w:lang w:val="nl-NL"/>
-              </w:rPr>
-              <w:t>(Ban hành theo Thông tư số 200/2014/TT-BTC</w:t>
-            </w:r>
-          </w:p>
-          <w:p>
-            <w:pPr>
-              <w:spacing w:line="288" w:lineRule="auto"/>
-              <w:jc w:val="center"/>
-              <w:rPr>
-                <w:sz w:val="26"/>
-                <w:szCs w:val="26"/>
-              </w:rPr>
-            </w:pPr>
-            <w:r>
-              <w:rPr>
-                <w:sz w:val="26"/>
-                <w:szCs w:val="26"/>
-                <w:lang w:val="nl-NL"/>
-              </w:rPr>
-              <w:t>Ngày 22/12/2014 của Bộ Tài chính)</w:t>
+                <w:i/>
+                <w:iCs/>
+                <w:lang w:val="nl-NL"/>
+              </w:rPr>
+              <w:t xml:space="preserve"> ngày 27/10/2025 của Bộ trưởng Bộ Tài chính)</w:t>
             </w:r>
           </w:p>
         </w:tc>
@@ -248,70 +248,7 @@
           <w:szCs w:val="28"/>
           <w:lang w:val="nl-NL"/>
         </w:rPr>
-        <w:t xml:space="preserve">Ngày {ngay_dntt_ngay} tháng {ngay_dntt_thang} năm {ngay_dntt_nam}</w:t>
-      </w:r>
-      <w:r>
-        <w:rPr>
-          <w:i/>
-          <w:sz w:val="28"/>
-          <w:szCs w:val="28"/>
-          <w:lang w:val="nl-NL"/>
-        </w:rPr>
-        <w:t xml:space="preserve"/>
-      </w:r>
-      <w:r>
-        <w:rPr>
-          <w:i/>
-          <w:sz w:val="28"/>
-          <w:szCs w:val="28"/>
-          <w:lang w:val="nl-NL"/>
-        </w:rPr>
-        <w:t xml:space="preserve"/>
-      </w:r>
-      <w:r>
-        <w:rPr>
-          <w:i/>
-          <w:sz w:val="28"/>
-          <w:szCs w:val="28"/>
-          <w:lang w:val="nl-NL"/>
-        </w:rPr>
-        <w:t xml:space="preserve"/>
-      </w:r>
-      <w:r>
-        <w:rPr>
-          <w:i/>
-          <w:sz w:val="28"/>
-          <w:szCs w:val="28"/>
-          <w:lang w:val="nl-NL"/>
-        </w:rPr>
-        <w:t xml:space="preserve"/>
-      </w:r>
-      <w:r>
-        <w:rPr>
-          <w:i/>
-          <w:sz w:val="28"/>
-          <w:szCs w:val="28"/>
-          <w:lang w:val="nl-NL"/>
-        </w:rPr>
-        <w:t xml:space="preserve"/>
-      </w:r>
-      <w:r>
-        <w:rPr>
-          <w:i/>
-          <w:sz w:val="28"/>
-          <w:szCs w:val="28"/>
-          <w:lang w:val="nl-NL"/>
-        </w:rPr>
-        <w:t xml:space="preserve"/>
-      </w:r>
-      <w:r>
-        <w:rPr>
-          <w:i/>
-          <w:sz w:val="28"/>
-          <w:szCs w:val="28"/>
-          <w:lang w:val="nl-NL"/>
-        </w:rPr>
-        <w:t xml:space="preserve"/>
+        <w:t>Ngày {ngay_dntt_ngay} tháng {ngay_dntt_thang} năm {ngay_dntt_nam}</w:t>
       </w:r>
     </w:p>
     <w:p>
@@ -391,15 +328,7 @@
           <w:szCs w:val="28"/>
           <w:lang w:val="nl-NL"/>
         </w:rPr>
-        <w:t xml:space="preserve">Họ và tên người đề nghị thanh toán: </w:t>
-      </w:r>
-      <w:r>
-        <w:rPr>
-          <w:sz w:val="28"/>
-          <w:szCs w:val="28"/>
-          <w:lang w:val="nl-NL"/>
-        </w:rPr>
-        <w:t xml:space="preserve">{ho_ten}</w:t>
+        <w:t xml:space="preserve">Họ và tên người đề nghị thanh toán: {ho_ten}</w:t>
       </w:r>
     </w:p>
     <w:p>
@@ -468,32 +397,14 @@
           <w:sz w:val="26"/>
           <w:szCs w:val="26"/>
         </w:rPr>
-        <w:t xml:space="preserve">{noi_dung}</w:t>
-      </w:r>
-      <w:r>
-        <w:rPr>
-          <w:b/>
-          <w:bCs/>
+        <w:t>{noi_dung}</w:t>
+      </w:r>
+      <w:r>
+        <w:rPr>
           <w:sz w:val="26"/>
           <w:szCs w:val="26"/>
         </w:rPr>
-        <w:t xml:space="preserve"/>
-      </w:r>
-      <w:r>
-        <w:rPr>
-          <w:b/>
-          <w:bCs/>
-          <w:sz w:val="26"/>
-          <w:szCs w:val="26"/>
-        </w:rPr>
-        <w:t xml:space="preserve"/>
-      </w:r>
-      <w:r>
-        <w:rPr>
-          <w:sz w:val="26"/>
-          <w:szCs w:val="26"/>
-        </w:rPr>
-        <w:t xml:space="preserve">;</w:t>
+        <w:t>;</w:t>
       </w:r>
     </w:p>
     <w:p>
@@ -505,45 +416,6 @@
         <w:spacing w:line="360" w:lineRule="auto"/>
         <w:jc w:val="both"/>
         <w:rPr>
-          <w:sz w:val="28"/>
-          <w:szCs w:val="28"/>
-        </w:rPr>
-      </w:pPr>
-      <w:r>
-        <w:rPr>
-          <w:sz w:val="28"/>
-          <w:szCs w:val="28"/>
-        </w:rPr>
-        <w:t xml:space="preserve">          Số tiền : </w:t>
-      </w:r>
-      <w:r>
-        <w:rPr>
-          <w:sz w:val="28"/>
-          <w:szCs w:val="28"/>
-        </w:rPr>
-        <w:t xml:space="preserve">{tong_tien}</w:t>
-      </w:r>
-      <w:r>
-        <w:rPr>
-          <w:sz w:val="28"/>
-          <w:szCs w:val="28"/>
-        </w:rPr>
-        <w:t xml:space="preserve"> </w:t>
-      </w:r>
-      <w:r>
-        <w:rPr>
-          <w:sz w:val="28"/>
-          <w:szCs w:val="28"/>
-        </w:rPr>
-        <w:t xml:space="preserve">VNĐ</w:t>
-      </w:r>
-    </w:p>
-    <w:p>
-      <w:pPr>
-        <w:spacing w:line="360" w:lineRule="auto"/>
-        <w:ind w:firstLine="720"/>
-        <w:jc w:val="both"/>
-        <w:rPr>
           <w:i/>
           <w:iCs/>
           <w:sz w:val="28"/>
@@ -553,33 +425,20 @@
       </w:pPr>
       <w:r>
         <w:rPr>
+          <w:sz w:val="28"/>
+          <w:szCs w:val="28"/>
+        </w:rPr>
+        <w:t xml:space="preserve">          Số tiền : {tong_tien} VNĐ </w:t>
+      </w:r>
+      <w:r>
+        <w:rPr>
           <w:i/>
           <w:iCs/>
           <w:sz w:val="28"/>
           <w:szCs w:val="28"/>
           <w:lang w:val="nl-NL"/>
         </w:rPr>
-        <w:t xml:space="preserve">(Viết bằng chữ: </w:t>
-      </w:r>
-      <w:r>
-        <w:rPr>
-          <w:i/>
-          <w:iCs/>
-          <w:sz w:val="28"/>
-          <w:szCs w:val="28"/>
-          <w:lang w:val="nl-NL"/>
-        </w:rPr>
-        <w:t xml:space="preserve">{tong_tien_chu}</w:t>
-      </w:r>
-      <w:r>
-        <w:rPr>
-          <w:i/>
-          <w:iCs/>
-          <w:sz w:val="28"/>
-          <w:szCs w:val="28"/>
-          <w:lang w:val="nl-NL"/>
-        </w:rPr>
-        <w:t xml:space="preserve">).</w:t>
+        <w:t xml:space="preserve">(Viết bằng chữ: {tong_tien_chu}).</w:t>
       </w:r>
     </w:p>
     <w:p>
@@ -622,71 +481,7 @@
           <w:szCs w:val="28"/>
           <w:lang w:val="nl-NL"/>
         </w:rPr>
-        <w:t xml:space="preserve">01 tờ trình ngày {ngay_to_trinh_ngay} tháng {ngay_to_trinh_thang} năm {ngay_to_trinh_nam}.</w:t>
-      </w:r>
-      <w:r>
-        <w:rPr>
-          <w:rFonts w:ascii="Times New Roman" w:hAnsi="Times New Roman"/>
-          <w:szCs w:val="28"/>
-          <w:lang w:val="nl-NL"/>
-        </w:rPr>
-        <w:t xml:space="preserve"/>
-      </w:r>
-      <w:r>
-        <w:rPr>
-          <w:rFonts w:ascii="Times New Roman" w:hAnsi="Times New Roman"/>
-          <w:szCs w:val="28"/>
-          <w:lang w:val="nl-NL"/>
-        </w:rPr>
-        <w:t xml:space="preserve"/>
-      </w:r>
-      <w:r>
-        <w:rPr>
-          <w:rFonts w:ascii="Times New Roman" w:hAnsi="Times New Roman"/>
-          <w:szCs w:val="28"/>
-          <w:lang w:val="nl-NL"/>
-        </w:rPr>
-        <w:t xml:space="preserve"/>
-      </w:r>
-      <w:r>
-        <w:rPr>
-          <w:rFonts w:ascii="Times New Roman" w:hAnsi="Times New Roman"/>
-          <w:szCs w:val="28"/>
-          <w:lang w:val="nl-NL"/>
-        </w:rPr>
-        <w:t xml:space="preserve"/>
-      </w:r>
-      <w:r>
-        <w:rPr>
-          <w:rFonts w:ascii="Times New Roman" w:hAnsi="Times New Roman"/>
-          <w:szCs w:val="28"/>
-          <w:lang w:val="nl-NL"/>
-        </w:rPr>
-        <w:t xml:space="preserve"/>
-      </w:r>
-      <w:r>
-        <w:rPr>
-          <w:rFonts w:ascii="Times New Roman" w:hAnsi="Times New Roman"/>
-          <w:szCs w:val="28"/>
-          <w:lang w:val="nl-NL"/>
-        </w:rPr>
-        <w:t xml:space="preserve"/>
-      </w:r>
-      <w:r>
-        <w:rPr>
-          <w:rFonts w:ascii="Times New Roman" w:hAnsi="Times New Roman"/>
-          <w:szCs w:val="28"/>
-          <w:lang w:val="nl-NL"/>
-        </w:rPr>
-        <w:t xml:space="preserve"/>
-      </w:r>
-      <w:r>
-        <w:rPr>
-          <w:rFonts w:ascii="Times New Roman" w:hAnsi="Times New Roman"/>
-          <w:szCs w:val="28"/>
-          <w:lang w:val="nl-NL"/>
-        </w:rPr>
-        <w:t xml:space="preserve"/>
+        <w:t>01 tờ trình ngày {ngay_to_trinh_ngay} tháng {ngay_to_trinh_thang} năm {ngay_to_trinh_nam}.</w:t>
       </w:r>
     </w:p>
     <w:p>
@@ -709,143 +504,7 @@
           <w:szCs w:val="28"/>
           <w:lang w:val="nl-NL"/>
         </w:rPr>
-        <w:t xml:space="preserve">{#ds_hoa_don}</w:t>
-      </w:r>
-      <w:r>
-        <w:rPr>
-          <w:rFonts w:ascii="Times New Roman" w:hAnsi="Times New Roman"/>
-          <w:szCs w:val="28"/>
-          <w:lang w:val="nl-NL"/>
-        </w:rPr>
-        <w:t xml:space="preserve"/>
-      </w:r>
-      <w:r>
-        <w:rPr>
-          <w:rFonts w:ascii="Times New Roman" w:hAnsi="Times New Roman"/>
-          <w:szCs w:val="28"/>
-          <w:lang w:val="nl-NL"/>
-        </w:rPr>
-        <w:t xml:space="preserve"/>
-      </w:r>
-      <w:r>
-        <w:rPr>
-          <w:rFonts w:ascii="Times New Roman" w:hAnsi="Times New Roman"/>
-          <w:szCs w:val="28"/>
-          <w:lang w:val="nl-NL"/>
-        </w:rPr>
-        <w:t xml:space="preserve"/>
-      </w:r>
-      <w:r>
-        <w:rPr>
-          <w:rFonts w:ascii="Times New Roman" w:hAnsi="Times New Roman"/>
-          <w:szCs w:val="28"/>
-          <w:lang w:val="nl-NL"/>
-        </w:rPr>
-        <w:t xml:space="preserve"/>
-      </w:r>
-      <w:r>
-        <w:rPr>
-          <w:rFonts w:ascii="Times New Roman" w:hAnsi="Times New Roman"/>
-          <w:szCs w:val="28"/>
-          <w:lang w:val="nl-NL"/>
-        </w:rPr>
-        <w:t xml:space="preserve"/>
-      </w:r>
-      <w:r>
-        <w:rPr>
-          <w:rFonts w:ascii="Times New Roman" w:hAnsi="Times New Roman"/>
-          <w:szCs w:val="28"/>
-          <w:lang w:val="nl-NL"/>
-        </w:rPr>
-        <w:t xml:space="preserve"/>
-      </w:r>
-      <w:r>
-        <w:rPr>
-          <w:rFonts w:ascii="Times New Roman" w:hAnsi="Times New Roman"/>
-          <w:szCs w:val="28"/>
-          <w:lang w:val="nl-NL"/>
-        </w:rPr>
-        <w:t xml:space="preserve"/>
-      </w:r>
-      <w:r>
-        <w:rPr>
-          <w:rFonts w:ascii="Times New Roman" w:hAnsi="Times New Roman"/>
-          <w:szCs w:val="28"/>
-          <w:lang w:val="nl-NL"/>
-        </w:rPr>
-        <w:t xml:space="preserve"/>
-      </w:r>
-      <w:r>
-        <w:rPr>
-          <w:rFonts w:ascii="Times New Roman" w:hAnsi="Times New Roman"/>
-          <w:szCs w:val="28"/>
-          <w:lang w:val="nl-NL"/>
-        </w:rPr>
-        <w:t xml:space="preserve"/>
-      </w:r>
-      <w:r>
-        <w:rPr>
-          <w:rFonts w:ascii="Times New Roman" w:hAnsi="Times New Roman"/>
-          <w:szCs w:val="28"/>
-          <w:lang w:val="nl-NL"/>
-        </w:rPr>
-        <w:t xml:space="preserve"/>
-      </w:r>
-      <w:r>
-        <w:rPr>
-          <w:rFonts w:ascii="Times New Roman" w:hAnsi="Times New Roman"/>
-          <w:szCs w:val="28"/>
-          <w:lang w:val="nl-NL"/>
-        </w:rPr>
-        <w:t xml:space="preserve"/>
-      </w:r>
-      <w:r>
-        <w:rPr>
-          <w:rFonts w:ascii="Times New Roman" w:hAnsi="Times New Roman"/>
-          <w:szCs w:val="28"/>
-          <w:lang w:val="nl-NL"/>
-        </w:rPr>
-        <w:t xml:space="preserve"/>
-      </w:r>
-      <w:r>
-        <w:rPr>
-          <w:rFonts w:ascii="Times New Roman" w:hAnsi="Times New Roman"/>
-          <w:szCs w:val="28"/>
-          <w:lang w:val="nl-NL"/>
-        </w:rPr>
-        <w:t xml:space="preserve"/>
-      </w:r>
-      <w:r>
-        <w:rPr>
-          <w:rFonts w:ascii="Times New Roman" w:hAnsi="Times New Roman"/>
-          <w:szCs w:val="28"/>
-          <w:lang w:val="nl-NL"/>
-        </w:rPr>
-        <w:t xml:space="preserve"/>
-      </w:r>
-      <w:r>
-        <w:rPr>
-          <w:rFonts w:ascii="Times New Roman" w:hAnsi="Times New Roman"/>
-          <w:szCs w:val="28"/>
-          <w:lang w:val="nl-NL"/>
-        </w:rPr>
-        <w:t xml:space="preserve"/>
-      </w:r>
-      <w:r>
-        <w:rPr>
-          <w:rFonts w:ascii="Times New Roman" w:hAnsi="Times New Roman"/>
-          <w:szCs w:val="28"/>
-          <w:lang w:val="nl-NL"/>
-        </w:rPr>
-        <w:t xml:space="preserve"/>
-      </w:r>
-      <w:r>
-        <w:rPr>
-          <w:rFonts w:ascii="Times New Roman" w:hAnsi="Times New Roman"/>
-          <w:szCs w:val="28"/>
-          <w:lang w:val="nl-NL"/>
-        </w:rPr>
-        <w:t xml:space="preserve"/>
+        <w:t>{#ds_hoa_don}</w:t>
       </w:r>
     </w:p>
     <w:p>
@@ -868,143 +527,7 @@
           <w:szCs w:val="28"/>
           <w:lang w:val="nl-NL"/>
         </w:rPr>
-        <w:t xml:space="preserve">01 hóa đơn GTGT: số {so_hd} ({ky_hieu}) ngày {ngay_hd}.</w:t>
-      </w:r>
-      <w:r>
-        <w:rPr>
-          <w:rFonts w:ascii="Times New Roman" w:hAnsi="Times New Roman"/>
-          <w:szCs w:val="28"/>
-          <w:lang w:val="nl-NL"/>
-        </w:rPr>
-        <w:t xml:space="preserve"/>
-      </w:r>
-      <w:r>
-        <w:rPr>
-          <w:rFonts w:ascii="Times New Roman" w:hAnsi="Times New Roman"/>
-          <w:szCs w:val="28"/>
-          <w:lang w:val="nl-NL"/>
-        </w:rPr>
-        <w:t xml:space="preserve"/>
-      </w:r>
-      <w:r>
-        <w:rPr>
-          <w:rFonts w:ascii="Times New Roman" w:hAnsi="Times New Roman"/>
-          <w:szCs w:val="28"/>
-          <w:lang w:val="nl-NL"/>
-        </w:rPr>
-        <w:t xml:space="preserve"/>
-      </w:r>
-      <w:r>
-        <w:rPr>
-          <w:rFonts w:ascii="Times New Roman" w:hAnsi="Times New Roman"/>
-          <w:szCs w:val="28"/>
-          <w:lang w:val="nl-NL"/>
-        </w:rPr>
-        <w:t xml:space="preserve"/>
-      </w:r>
-      <w:r>
-        <w:rPr>
-          <w:rFonts w:ascii="Times New Roman" w:hAnsi="Times New Roman"/>
-          <w:szCs w:val="28"/>
-          <w:lang w:val="nl-NL"/>
-        </w:rPr>
-        <w:t xml:space="preserve"/>
-      </w:r>
-      <w:r>
-        <w:rPr>
-          <w:rFonts w:ascii="Times New Roman" w:hAnsi="Times New Roman"/>
-          <w:szCs w:val="28"/>
-          <w:lang w:val="nl-NL"/>
-        </w:rPr>
-        <w:t xml:space="preserve"/>
-      </w:r>
-      <w:r>
-        <w:rPr>
-          <w:rFonts w:ascii="Times New Roman" w:hAnsi="Times New Roman"/>
-          <w:szCs w:val="28"/>
-          <w:lang w:val="nl-NL"/>
-        </w:rPr>
-        <w:t xml:space="preserve"/>
-      </w:r>
-      <w:r>
-        <w:rPr>
-          <w:rFonts w:ascii="Times New Roman" w:hAnsi="Times New Roman"/>
-          <w:szCs w:val="28"/>
-          <w:lang w:val="nl-NL"/>
-        </w:rPr>
-        <w:t xml:space="preserve"/>
-      </w:r>
-      <w:r>
-        <w:rPr>
-          <w:rFonts w:ascii="Times New Roman" w:hAnsi="Times New Roman"/>
-          <w:szCs w:val="28"/>
-          <w:lang w:val="nl-NL"/>
-        </w:rPr>
-        <w:t xml:space="preserve"/>
-      </w:r>
-      <w:r>
-        <w:rPr>
-          <w:rFonts w:ascii="Times New Roman" w:hAnsi="Times New Roman"/>
-          <w:szCs w:val="28"/>
-          <w:lang w:val="nl-NL"/>
-        </w:rPr>
-        <w:t xml:space="preserve"/>
-      </w:r>
-      <w:r>
-        <w:rPr>
-          <w:rFonts w:ascii="Times New Roman" w:hAnsi="Times New Roman"/>
-          <w:szCs w:val="28"/>
-          <w:lang w:val="nl-NL"/>
-        </w:rPr>
-        <w:t xml:space="preserve"/>
-      </w:r>
-      <w:r>
-        <w:rPr>
-          <w:rFonts w:ascii="Times New Roman" w:hAnsi="Times New Roman"/>
-          <w:szCs w:val="28"/>
-          <w:lang w:val="nl-NL"/>
-        </w:rPr>
-        <w:t xml:space="preserve"/>
-      </w:r>
-      <w:r>
-        <w:rPr>
-          <w:rFonts w:ascii="Times New Roman" w:hAnsi="Times New Roman"/>
-          <w:szCs w:val="28"/>
-          <w:lang w:val="nl-NL"/>
-        </w:rPr>
-        <w:t xml:space="preserve"/>
-      </w:r>
-      <w:r>
-        <w:rPr>
-          <w:rFonts w:ascii="Times New Roman" w:hAnsi="Times New Roman"/>
-          <w:szCs w:val="28"/>
-          <w:lang w:val="nl-NL"/>
-        </w:rPr>
-        <w:t xml:space="preserve"/>
-      </w:r>
-      <w:r>
-        <w:rPr>
-          <w:rFonts w:ascii="Times New Roman" w:hAnsi="Times New Roman"/>
-          <w:szCs w:val="28"/>
-          <w:lang w:val="nl-NL"/>
-        </w:rPr>
-        <w:t xml:space="preserve"/>
-      </w:r>
-      <w:r>
-        <w:rPr>
-          <w:rFonts w:ascii="Times New Roman" w:hAnsi="Times New Roman"/>
-          <w:szCs w:val="28"/>
-          <w:lang w:val="nl-NL"/>
-        </w:rPr>
-        <w:t xml:space="preserve"/>
-      </w:r>
-      <w:r>
-        <w:rPr>
-          <w:rFonts w:ascii="Times New Roman" w:hAnsi="Times New Roman"/>
-          <w:szCs w:val="28"/>
-          <w:lang w:val="nl-NL"/>
-        </w:rPr>
-        <w:t xml:space="preserve"/>
+        <w:t>01 hóa đơn GTGT: số {so_hd} ({ky_hieu}) ngày {ngay_hd}.</w:t>
       </w:r>
     </w:p>
     <w:p>
@@ -1027,143 +550,7 @@
           <w:szCs w:val="28"/>
           <w:lang w:val="nl-NL"/>
         </w:rPr>
-        <w:t xml:space="preserve">{/ds_hoa_don}</w:t>
-      </w:r>
-      <w:r>
-        <w:rPr>
-          <w:rFonts w:ascii="Times New Roman" w:hAnsi="Times New Roman"/>
-          <w:szCs w:val="28"/>
-          <w:lang w:val="nl-NL"/>
-        </w:rPr>
-        <w:t xml:space="preserve"/>
-      </w:r>
-      <w:r>
-        <w:rPr>
-          <w:rFonts w:ascii="Times New Roman" w:hAnsi="Times New Roman"/>
-          <w:szCs w:val="28"/>
-          <w:lang w:val="nl-NL"/>
-        </w:rPr>
-        <w:t xml:space="preserve"/>
-      </w:r>
-      <w:r>
-        <w:rPr>
-          <w:rFonts w:ascii="Times New Roman" w:hAnsi="Times New Roman"/>
-          <w:szCs w:val="28"/>
-          <w:lang w:val="nl-NL"/>
-        </w:rPr>
-        <w:t xml:space="preserve"/>
-      </w:r>
-      <w:r>
-        <w:rPr>
-          <w:rFonts w:ascii="Times New Roman" w:hAnsi="Times New Roman"/>
-          <w:szCs w:val="28"/>
-          <w:lang w:val="nl-NL"/>
-        </w:rPr>
-        <w:t xml:space="preserve"/>
-      </w:r>
-      <w:r>
-        <w:rPr>
-          <w:rFonts w:ascii="Times New Roman" w:hAnsi="Times New Roman"/>
-          <w:szCs w:val="28"/>
-          <w:lang w:val="nl-NL"/>
-        </w:rPr>
-        <w:t xml:space="preserve"/>
-      </w:r>
-      <w:r>
-        <w:rPr>
-          <w:rFonts w:ascii="Times New Roman" w:hAnsi="Times New Roman"/>
-          <w:szCs w:val="28"/>
-          <w:lang w:val="nl-NL"/>
-        </w:rPr>
-        <w:t xml:space="preserve"/>
-      </w:r>
-      <w:r>
-        <w:rPr>
-          <w:rFonts w:ascii="Times New Roman" w:hAnsi="Times New Roman"/>
-          <w:szCs w:val="28"/>
-          <w:lang w:val="nl-NL"/>
-        </w:rPr>
-        <w:t xml:space="preserve"/>
-      </w:r>
-      <w:r>
-        <w:rPr>
-          <w:rFonts w:ascii="Times New Roman" w:hAnsi="Times New Roman"/>
-          <w:szCs w:val="28"/>
-          <w:lang w:val="nl-NL"/>
-        </w:rPr>
-        <w:t xml:space="preserve"/>
-      </w:r>
-      <w:r>
-        <w:rPr>
-          <w:rFonts w:ascii="Times New Roman" w:hAnsi="Times New Roman"/>
-          <w:szCs w:val="28"/>
-          <w:lang w:val="nl-NL"/>
-        </w:rPr>
-        <w:t xml:space="preserve"/>
-      </w:r>
-      <w:r>
-        <w:rPr>
-          <w:rFonts w:ascii="Times New Roman" w:hAnsi="Times New Roman"/>
-          <w:szCs w:val="28"/>
-          <w:lang w:val="nl-NL"/>
-        </w:rPr>
-        <w:t xml:space="preserve"/>
-      </w:r>
-      <w:r>
-        <w:rPr>
-          <w:rFonts w:ascii="Times New Roman" w:hAnsi="Times New Roman"/>
-          <w:szCs w:val="28"/>
-          <w:lang w:val="nl-NL"/>
-        </w:rPr>
-        <w:t xml:space="preserve"/>
-      </w:r>
-      <w:r>
-        <w:rPr>
-          <w:rFonts w:ascii="Times New Roman" w:hAnsi="Times New Roman"/>
-          <w:szCs w:val="28"/>
-          <w:lang w:val="nl-NL"/>
-        </w:rPr>
-        <w:t xml:space="preserve"/>
-      </w:r>
-      <w:r>
-        <w:rPr>
-          <w:rFonts w:ascii="Times New Roman" w:hAnsi="Times New Roman"/>
-          <w:szCs w:val="28"/>
-          <w:lang w:val="nl-NL"/>
-        </w:rPr>
-        <w:t xml:space="preserve"/>
-      </w:r>
-      <w:r>
-        <w:rPr>
-          <w:rFonts w:ascii="Times New Roman" w:hAnsi="Times New Roman"/>
-          <w:szCs w:val="28"/>
-          <w:lang w:val="nl-NL"/>
-        </w:rPr>
-        <w:t xml:space="preserve"/>
-      </w:r>
-      <w:r>
-        <w:rPr>
-          <w:rFonts w:ascii="Times New Roman" w:hAnsi="Times New Roman"/>
-          <w:szCs w:val="28"/>
-          <w:lang w:val="nl-NL"/>
-        </w:rPr>
-        <w:t xml:space="preserve"/>
-      </w:r>
-      <w:r>
-        <w:rPr>
-          <w:rFonts w:ascii="Times New Roman" w:hAnsi="Times New Roman"/>
-          <w:szCs w:val="28"/>
-          <w:lang w:val="nl-NL"/>
-        </w:rPr>
-        <w:t xml:space="preserve"/>
-      </w:r>
-      <w:r>
-        <w:rPr>
-          <w:rFonts w:ascii="Times New Roman" w:hAnsi="Times New Roman"/>
-          <w:szCs w:val="28"/>
-          <w:lang w:val="nl-NL"/>
-        </w:rPr>
-        <w:t xml:space="preserve"/>
+        <w:t>{/ds_hoa_don}</w:t>
       </w:r>
     </w:p>
     <w:p>
@@ -1368,15 +755,15 @@
     </w:p>
     <w:tbl>
       <w:tblPr>
-        <w:tblW w:w="10171" w:type="dxa"/>
+        <w:tblW w:w="9498" w:type="dxa"/>
         <w:jc w:val="center"/>
         <w:tblLook w:val="04A0" w:firstRow="1" w:lastRow="0" w:firstColumn="1" w:lastColumn="0" w:noHBand="0" w:noVBand="1"/>
       </w:tblPr>
       <w:tblGrid>
-        <w:gridCol w:w="2835"/>
+        <w:gridCol w:w="2268"/>
         <w:gridCol w:w="2552"/>
-        <w:gridCol w:w="2462"/>
-        <w:gridCol w:w="2322"/>
+        <w:gridCol w:w="2126"/>
+        <w:gridCol w:w="2552"/>
       </w:tblGrid>
       <w:tr>
         <w:trPr>
@@ -1384,28 +771,39 @@
         </w:trPr>
         <w:tc>
           <w:tcPr>
-            <w:tcW w:w="2835" w:type="dxa"/>
+            <w:tcW w:w="2268" w:type="dxa"/>
             <w:hideMark/>
           </w:tcPr>
           <w:p>
             <w:pPr>
-              <w:spacing w:line="360" w:lineRule="auto"/>
-              <w:jc w:val="center"/>
-              <w:rPr>
-                <w:b/>
-                <w:sz w:val="26"/>
-                <w:szCs w:val="26"/>
+              <w:jc w:val="center"/>
+              <w:rPr>
+                <w:b/>
                 <w:lang w:val="nl-NL"/>
               </w:rPr>
             </w:pPr>
             <w:r>
               <w:rPr>
                 <w:b/>
-                <w:sz w:val="26"/>
-                <w:szCs w:val="26"/>
-                <w:lang w:val="nl-NL"/>
-              </w:rPr>
-              <w:t>NGƯỜI ĐỀ NGHỊ</w:t>
+                <w:lang w:val="nl-NL"/>
+              </w:rPr>
+              <w:t>Người đề nghị</w:t>
+            </w:r>
+          </w:p>
+          <w:p>
+            <w:pPr>
+              <w:jc w:val="center"/>
+              <w:rPr>
+                <w:b/>
+                <w:lang w:val="nl-NL"/>
+              </w:rPr>
+            </w:pPr>
+            <w:r>
+              <w:rPr>
+                <w:b/>
+                <w:lang w:val="nl-NL"/>
+              </w:rPr>
+              <w:t>thanh toán</w:t>
             </w:r>
           </w:p>
         </w:tc>
@@ -1416,77 +814,87 @@
           </w:tcPr>
           <w:p>
             <w:pPr>
-              <w:spacing w:line="360" w:lineRule="auto"/>
-              <w:jc w:val="center"/>
-              <w:rPr>
-                <w:b/>
-                <w:sz w:val="26"/>
-                <w:szCs w:val="26"/>
+              <w:jc w:val="center"/>
+              <w:rPr>
+                <w:b/>
                 <w:lang w:val="nl-NL"/>
               </w:rPr>
             </w:pPr>
             <w:r>
               <w:rPr>
                 <w:b/>
-                <w:sz w:val="26"/>
-                <w:szCs w:val="26"/>
-                <w:lang w:val="nl-NL"/>
-              </w:rPr>
-              <w:t>P. KT-AT</w:t>
+                <w:lang w:val="nl-NL"/>
+              </w:rPr>
+              <w:t>Phòng</w:t>
+            </w:r>
+          </w:p>
+          <w:p>
+            <w:pPr>
+              <w:jc w:val="center"/>
+              <w:rPr>
+                <w:b/>
+                <w:lang w:val="nl-NL"/>
+              </w:rPr>
+            </w:pPr>
+            <w:r>
+              <w:rPr>
+                <w:b/>
+                <w:lang w:val="nl-NL"/>
+              </w:rPr>
+              <w:t>Kỹ thuật an toàn</w:t>
             </w:r>
           </w:p>
         </w:tc>
         <w:tc>
           <w:tcPr>
-            <w:tcW w:w="2462" w:type="dxa"/>
+            <w:tcW w:w="2126" w:type="dxa"/>
             <w:hideMark/>
           </w:tcPr>
           <w:p>
             <w:pPr>
-              <w:spacing w:line="360" w:lineRule="auto"/>
-              <w:jc w:val="center"/>
-              <w:rPr>
-                <w:b/>
-                <w:sz w:val="26"/>
-                <w:szCs w:val="26"/>
+              <w:jc w:val="center"/>
+              <w:rPr>
+                <w:b/>
                 <w:lang w:val="nl-NL"/>
               </w:rPr>
             </w:pPr>
             <w:r>
               <w:rPr>
                 <w:b/>
-                <w:sz w:val="26"/>
-                <w:szCs w:val="26"/>
-                <w:lang w:val="nl-NL"/>
-              </w:rPr>
-              <w:t>P. TCKT</w:t>
+                <w:lang w:val="nl-NL"/>
+              </w:rPr>
+              <w:t>Kế toán trưởng</w:t>
             </w:r>
+          </w:p>
+          <w:p>
+            <w:pPr>
+              <w:jc w:val="center"/>
+              <w:rPr>
+                <w:b/>
+                <w:lang w:val="nl-NL"/>
+              </w:rPr>
+            </w:pPr>
           </w:p>
         </w:tc>
         <w:tc>
           <w:tcPr>
-            <w:tcW w:w="2322" w:type="dxa"/>
+            <w:tcW w:w="2552" w:type="dxa"/>
             <w:hideMark/>
           </w:tcPr>
           <w:p>
             <w:pPr>
-              <w:spacing w:line="360" w:lineRule="auto"/>
-              <w:jc w:val="center"/>
-              <w:rPr>
-                <w:b/>
-                <w:sz w:val="26"/>
-                <w:szCs w:val="26"/>
+              <w:jc w:val="center"/>
+              <w:rPr>
+                <w:b/>
                 <w:lang w:val="nl-NL"/>
               </w:rPr>
             </w:pPr>
             <w:r>
               <w:rPr>
                 <w:b/>
-                <w:sz w:val="26"/>
-                <w:szCs w:val="26"/>
-                <w:lang w:val="nl-NL"/>
-              </w:rPr>
-              <w:t>GIÁM ĐỐC</w:t>
+                <w:lang w:val="nl-NL"/>
+              </w:rPr>
+              <w:t>Giám đốc</w:t>
             </w:r>
           </w:p>
         </w:tc>
@@ -1497,68 +905,64 @@
         </w:trPr>
         <w:tc>
           <w:tcPr>
-            <w:tcW w:w="2835" w:type="dxa"/>
+            <w:tcW w:w="2268" w:type="dxa"/>
           </w:tcPr>
           <w:p>
             <w:pPr>
-              <w:spacing w:line="360" w:lineRule="auto"/>
-              <w:jc w:val="center"/>
-              <w:rPr>
-                <w:b/>
-                <w:sz w:val="26"/>
-                <w:szCs w:val="26"/>
-                <w:lang w:val="nl-NL"/>
-              </w:rPr>
-            </w:pPr>
-          </w:p>
-          <w:p>
-            <w:pPr>
-              <w:spacing w:line="360" w:lineRule="auto"/>
-              <w:jc w:val="center"/>
-              <w:rPr>
-                <w:b/>
-                <w:sz w:val="26"/>
-                <w:szCs w:val="26"/>
-                <w:lang w:val="nl-NL"/>
-              </w:rPr>
-            </w:pPr>
-          </w:p>
-          <w:p>
-            <w:pPr>
-              <w:spacing w:line="360" w:lineRule="auto"/>
-              <w:rPr>
-                <w:b/>
-                <w:sz w:val="26"/>
-                <w:szCs w:val="26"/>
+              <w:jc w:val="center"/>
+              <w:rPr>
+                <w:b/>
+                <w:lang w:val="nl-NL"/>
+              </w:rPr>
+            </w:pPr>
+          </w:p>
+          <w:p>
+            <w:pPr>
+              <w:jc w:val="center"/>
+              <w:rPr>
+                <w:b/>
+                <w:lang w:val="nl-NL"/>
+              </w:rPr>
+            </w:pPr>
+          </w:p>
+          <w:p>
+            <w:pPr>
+              <w:jc w:val="center"/>
+              <w:rPr>
+                <w:b/>
+                <w:lang w:val="nl-NL"/>
+              </w:rPr>
+            </w:pPr>
+          </w:p>
+          <w:p>
+            <w:pPr>
+              <w:jc w:val="center"/>
+              <w:rPr>
+                <w:b/>
+                <w:lang w:val="nl-NL"/>
+              </w:rPr>
+            </w:pPr>
+          </w:p>
+          <w:p>
+            <w:pPr>
+              <w:jc w:val="center"/>
+              <w:rPr>
+                <w:b/>
+                <w:lang w:val="nl-NL"/>
+              </w:rPr>
+            </w:pPr>
+          </w:p>
+          <w:p>
+            <w:pPr>
+              <w:jc w:val="center"/>
+              <w:rPr>
+                <w:b/>
                 <w:lang w:val="nl-NL"/>
               </w:rPr>
             </w:pPr>
             <w:r>
               <w:rPr>
                 <w:b/>
-                <w:sz w:val="26"/>
-                <w:szCs w:val="26"/>
-                <w:lang w:val="nl-NL"/>
-              </w:rPr>
-              <w:t xml:space="preserve"> </w:t>
-            </w:r>
-          </w:p>
-          <w:p>
-            <w:pPr>
-              <w:spacing w:line="360" w:lineRule="auto"/>
-              <w:jc w:val="center"/>
-              <w:rPr>
-                <w:b/>
-                <w:sz w:val="26"/>
-                <w:szCs w:val="26"/>
-                <w:lang w:val="nl-NL"/>
-              </w:rPr>
-            </w:pPr>
-            <w:r>
-              <w:rPr>
-                <w:b/>
-                <w:sz w:val="26"/>
-                <w:szCs w:val="26"/>
                 <w:lang w:val="nl-NL"/>
               </w:rPr>
               <w:t xml:space="preserve">{ho_ten}</w:t>
@@ -1571,87 +975,179 @@
           </w:tcPr>
           <w:p>
             <w:pPr>
-              <w:spacing w:line="360" w:lineRule="auto"/>
-              <w:jc w:val="center"/>
-              <w:rPr>
-                <w:b/>
-                <w:sz w:val="26"/>
-                <w:szCs w:val="26"/>
-                <w:lang w:val="nl-NL"/>
-              </w:rPr>
-            </w:pPr>
-          </w:p>
-          <w:p>
-            <w:pPr>
-              <w:spacing w:line="360" w:lineRule="auto"/>
-              <w:jc w:val="center"/>
-              <w:rPr>
-                <w:b/>
-                <w:sz w:val="26"/>
-                <w:szCs w:val="26"/>
-                <w:lang w:val="nl-NL"/>
-              </w:rPr>
-            </w:pPr>
-          </w:p>
-          <w:p>
-            <w:pPr>
-              <w:spacing w:line="360" w:lineRule="auto"/>
-              <w:rPr>
-                <w:b/>
-                <w:sz w:val="26"/>
-                <w:szCs w:val="26"/>
-                <w:lang w:val="nl-NL"/>
-              </w:rPr>
-            </w:pPr>
-          </w:p>
-          <w:p>
-            <w:pPr>
-              <w:spacing w:line="360" w:lineRule="auto"/>
-              <w:rPr>
-                <w:b/>
-                <w:sz w:val="26"/>
-                <w:szCs w:val="26"/>
+              <w:jc w:val="center"/>
+              <w:rPr>
+                <w:b/>
+                <w:lang w:val="nl-NL"/>
+              </w:rPr>
+            </w:pPr>
+          </w:p>
+          <w:p>
+            <w:pPr>
+              <w:jc w:val="center"/>
+              <w:rPr>
+                <w:b/>
+                <w:lang w:val="nl-NL"/>
+              </w:rPr>
+            </w:pPr>
+          </w:p>
+          <w:p>
+            <w:pPr>
+              <w:jc w:val="center"/>
+              <w:rPr>
+                <w:b/>
+                <w:lang w:val="nl-NL"/>
+              </w:rPr>
+            </w:pPr>
+          </w:p>
+          <w:p>
+            <w:pPr>
+              <w:jc w:val="center"/>
+              <w:rPr>
+                <w:b/>
+                <w:lang w:val="nl-NL"/>
+              </w:rPr>
+            </w:pPr>
+          </w:p>
+          <w:p>
+            <w:pPr>
+              <w:jc w:val="center"/>
+              <w:rPr>
+                <w:b/>
+                <w:lang w:val="nl-NL"/>
+              </w:rPr>
+            </w:pPr>
+          </w:p>
+          <w:p>
+            <w:pPr>
+              <w:jc w:val="center"/>
+              <w:rPr>
+                <w:b/>
                 <w:lang w:val="nl-NL"/>
               </w:rPr>
             </w:pPr>
             <w:r>
               <w:rPr>
                 <w:b/>
-                <w:sz w:val="26"/>
-                <w:szCs w:val="26"/>
-                <w:lang w:val="nl-NL"/>
-              </w:rPr>
-              <w:t>Nguyễn Quang Hòa</w:t>
+                <w:lang w:val="nl-NL"/>
+              </w:rPr>
+              <w:t xml:space="preserve">Nguyễn Quang Hòa</w:t>
             </w:r>
           </w:p>
         </w:tc>
         <w:tc>
           <w:tcPr>
-            <w:tcW w:w="2462" w:type="dxa"/>
+            <w:tcW w:w="2126" w:type="dxa"/>
           </w:tcPr>
           <w:p>
             <w:pPr>
-              <w:spacing w:line="360" w:lineRule="auto"/>
-              <w:jc w:val="both"/>
-              <w:rPr>
-                <w:sz w:val="26"/>
-                <w:szCs w:val="26"/>
-                <w:lang w:val="nl-NL"/>
-              </w:rPr>
-            </w:pPr>
+              <w:jc w:val="center"/>
+              <w:rPr>
+                <w:b/>
+                <w:bCs/>
+                <w:lang w:val="nl-NL"/>
+              </w:rPr>
+            </w:pPr>
+          </w:p>
+          <w:p>
+            <w:pPr>
+              <w:jc w:val="center"/>
+              <w:rPr>
+                <w:b/>
+                <w:bCs/>
+                <w:lang w:val="nl-NL"/>
+              </w:rPr>
+            </w:pPr>
+          </w:p>
+          <w:p>
+            <w:pPr>
+              <w:jc w:val="center"/>
+              <w:rPr>
+                <w:b/>
+                <w:bCs/>
+                <w:lang w:val="nl-NL"/>
+              </w:rPr>
+            </w:pPr>
+          </w:p>
+          <w:p>
+            <w:pPr>
+              <w:jc w:val="center"/>
+              <w:rPr>
+                <w:b/>
+                <w:bCs/>
+                <w:lang w:val="nl-NL"/>
+              </w:rPr>
+            </w:pPr>
+          </w:p>
+          <w:p>
+            <w:pPr>
+              <w:jc w:val="center"/>
+              <w:rPr>
+                <w:b/>
+                <w:bCs/>
+                <w:lang w:val="nl-NL"/>
+              </w:rPr>
+            </w:pPr>
+          </w:p>
+          <w:p>
+            <w:pPr>
+              <w:jc w:val="center"/>
+              <w:rPr>
+                <w:b/>
+                <w:bCs/>
+                <w:lang w:val="nl-NL"/>
+              </w:rPr>
+            </w:pPr>
+            <w:r>
+              <w:rPr>
+                <w:b/>
+                <w:bCs/>
+                <w:lang w:val="nl-NL"/>
+              </w:rPr>
+              <w:t>Lê Duy</w:t>
+            </w:r>
           </w:p>
         </w:tc>
         <w:tc>
           <w:tcPr>
-            <w:tcW w:w="2322" w:type="dxa"/>
+            <w:tcW w:w="2552" w:type="dxa"/>
           </w:tcPr>
           <w:p>
             <w:pPr>
-              <w:spacing w:line="360" w:lineRule="auto"/>
-              <w:jc w:val="both"/>
-              <w:rPr>
-                <w:sz w:val="26"/>
-                <w:szCs w:val="26"/>
+              <w:jc w:val="center"/>
+              <w:rPr>
+                <w:b/>
+                <w:bCs/>
+                <w:lang w:val="nl-NL"/>
+              </w:rPr>
+            </w:pPr>
+          </w:p>
+          <w:p>
+            <w:pPr>
+              <w:jc w:val="center"/>
+              <w:rPr>
+                <w:b/>
+                <w:bCs/>
+                <w:lang w:val="nl-NL"/>
+              </w:rPr>
+            </w:pPr>
+          </w:p>
+          <w:p>
+            <w:pPr>
+              <w:jc w:val="center"/>
+              <w:rPr>
+                <w:b/>
+                <w:bCs/>
+                <w:lang w:val="nl-NL"/>
+              </w:rPr>
+            </w:pPr>
+          </w:p>
+          <w:p>
+            <w:pPr>
+              <w:jc w:val="center"/>
+              <w:rPr>
+                <w:b/>
+                <w:bCs/>
                 <w:lang w:val="nl-NL"/>
               </w:rPr>
             </w:pPr>
@@ -2468,6 +1964,7 @@
   <w:style w:type="character" w:default="1" w:styleId="DefaultParagraphFont">
     <w:name w:val="Default Paragraph Font"/>
     <w:uiPriority w:val="1"/>
+    <w:semiHidden/>
     <w:unhideWhenUsed/>
   </w:style>
   <w:style w:type="table" w:default="1" w:styleId="TableNormal">

</xml_diff>